<commit_message>
feat(figures): redesign Figure 1 into a clean publication-grade architecture diagram across PDF and DOCX
</commit_message>
<xml_diff>
--- a/SAMPLE_RESEARCH_PAPER.docx
+++ b/SAMPLE_RESEARCH_PAPER.docx
@@ -264,7 +264,7 @@
       <w:r>
         <w:drawing>
           <wp:inline xmlns:a="http://schemas.openxmlformats.org/drawingml/2006/main" xmlns:pic="http://schemas.openxmlformats.org/drawingml/2006/picture">
-            <wp:extent cx="4389120" cy="2633472"/>
+            <wp:extent cx="4389120" cy="1771295"/>
             <wp:docPr id="1" name="Picture 1"/>
             <wp:cNvGraphicFramePr>
               <a:graphicFrameLocks noChangeAspect="1"/>
@@ -285,7 +285,7 @@
                   <pic:spPr>
                     <a:xfrm>
                       <a:off x="0" y="0"/>
-                      <a:ext cx="4389120" cy="2633472"/>
+                      <a:ext cx="4389120" cy="1771295"/>
                     </a:xfrm>
                     <a:prstGeom prst="rect"/>
                   </pic:spPr>

</xml_diff>

<commit_message>
refactor(figure_1): restore original layout with sharp rectangular boxes, large legible text, and non-overlapping arrow paths across PDF and DOCX
</commit_message>
<xml_diff>
--- a/SAMPLE_RESEARCH_PAPER.docx
+++ b/SAMPLE_RESEARCH_PAPER.docx
@@ -264,7 +264,7 @@
       <w:r>
         <w:drawing>
           <wp:inline xmlns:a="http://schemas.openxmlformats.org/drawingml/2006/main" xmlns:pic="http://schemas.openxmlformats.org/drawingml/2006/picture">
-            <wp:extent cx="4389120" cy="1771295"/>
+            <wp:extent cx="4389120" cy="2608723"/>
             <wp:docPr id="1" name="Picture 1"/>
             <wp:cNvGraphicFramePr>
               <a:graphicFrameLocks noChangeAspect="1"/>
@@ -285,7 +285,7 @@
                   <pic:spPr>
                     <a:xfrm>
                       <a:off x="0" y="0"/>
-                      <a:ext cx="4389120" cy="1771295"/>
+                      <a:ext cx="4389120" cy="2608723"/>
                     </a:xfrm>
                     <a:prstGeom prst="rect"/>
                   </pic:spPr>

</xml_diff>

<commit_message>
style(figure_1): increase text font size, weight, and contrast inside all diagram boxes
</commit_message>
<xml_diff>
--- a/SAMPLE_RESEARCH_PAPER.docx
+++ b/SAMPLE_RESEARCH_PAPER.docx
@@ -264,7 +264,7 @@
       <w:r>
         <w:drawing>
           <wp:inline xmlns:a="http://schemas.openxmlformats.org/drawingml/2006/main" xmlns:pic="http://schemas.openxmlformats.org/drawingml/2006/picture">
-            <wp:extent cx="4389120" cy="2608723"/>
+            <wp:extent cx="4389120" cy="2754071"/>
             <wp:docPr id="1" name="Picture 1"/>
             <wp:cNvGraphicFramePr>
               <a:graphicFrameLocks noChangeAspect="1"/>
@@ -285,7 +285,7 @@
                   <pic:spPr>
                     <a:xfrm>
                       <a:off x="0" y="0"/>
-                      <a:ext cx="4389120" cy="2608723"/>
+                      <a:ext cx="4389120" cy="2754071"/>
                     </a:xfrm>
                     <a:prstGeom prst="rect"/>
                   </pic:spPr>

</xml_diff>